<commit_message>
Resync Data Analytics resume content
Product Management Intern end date updated (June-August 2026, was
open-ended) and a new bullet added covering cohort analysis for
segment-specific adoption patterns. Re-extracted into both
resume-library.json copies (resume-templates/ and extension/) — they
were byte-identical before this change and stayed in sync after.

Verified live: asked Gemini to analyze a JD requiring cohort analysis
and segment-specific adoption pattern experience, and it correctly
cited this newly-added bullet in its 職責覆蓋/履歷理由 output, confirming
both the website and extension are reading the updated content.

Co-Authored-By: Claude Sonnet 5 <noreply@anthropic.com>
</commit_message>
<xml_diff>
--- a/resume-templates/Data Analytics.docx
+++ b/resume-templates/Data Analytics.docx
@@ -390,7 +390,7 @@
           <w:rtl w:val="0"/>
         </w:rPr>
         <w:tab/>
-        <w:t xml:space="preserve">June 2026 - Present</w:t>
+        <w:t xml:space="preserve">June 2026 - August 2026</w:t>
       </w:r>
     </w:p>
     <w:p>
@@ -460,83 +460,6 @@
     </w:p>
     <w:p>
       <w:pPr>
-        <w:tabs>
-          <w:tab w:val="right" w:leader="none" w:pos="10770"/>
-        </w:tabs>
-        <w:spacing w:after="18" w:line="216" w:lineRule="auto"/>
-        <w:ind w:left="720" w:right="-720" w:firstLine="0"/>
-        <w:rPr>
-          <w:rFonts w:ascii="Calibri" w:cs="Calibri" w:eastAsia="Calibri" w:hAnsi="Calibri"/>
-          <w:sz w:val="8"/>
-          <w:szCs w:val="8"/>
-        </w:rPr>
-      </w:pPr>
-      <w:r>
-        <w:rPr>
-          <w:rtl w:val="0"/>
-        </w:rPr>
-      </w:r>
-    </w:p>
-    <w:p>
-      <w:pPr>
-        <w:tabs>
-          <w:tab w:val="right" w:leader="none" w:pos="10770"/>
-        </w:tabs>
-        <w:spacing w:after="18" w:line="216" w:lineRule="auto"/>
-        <w:ind w:left="-540" w:right="-720" w:hanging="180"/>
-        <w:rPr>
-          <w:rFonts w:ascii="Calibri" w:cs="Calibri" w:eastAsia="Calibri" w:hAnsi="Calibri"/>
-        </w:rPr>
-      </w:pPr>
-      <w:r>
-        <w:rPr>
-          <w:rFonts w:ascii="Calibri" w:cs="Calibri" w:eastAsia="Calibri" w:hAnsi="Calibri"/>
-          <w:b w:val="1"/>
-          <w:bCs w:val="1"/>
-          <w:rtl w:val="0"/>
-        </w:rPr>
-        <w:t xml:space="preserve">Marketing Intern</w:t>
-      </w:r>
-      <w:r>
-        <w:rPr>
-          <w:rFonts w:ascii="Calibri" w:cs="Calibri" w:eastAsia="Calibri" w:hAnsi="Calibri"/>
-          <w:rtl w:val="0"/>
-        </w:rPr>
-        <w:tab/>
-        <w:t xml:space="preserve">February 2024 - June 2024</w:t>
-      </w:r>
-    </w:p>
-    <w:p>
-      <w:pPr>
-        <w:tabs>
-          <w:tab w:val="right" w:leader="none" w:pos="10770"/>
-        </w:tabs>
-        <w:spacing w:after="18" w:line="216" w:lineRule="auto"/>
-        <w:ind w:left="-540" w:right="-720" w:hanging="180"/>
-        <w:rPr>
-          <w:b w:val="1"/>
-          <w:bCs w:val="1"/>
-          <w:sz w:val="19"/>
-          <w:szCs w:val="19"/>
-        </w:rPr>
-      </w:pPr>
-      <w:r>
-        <w:rPr>
-          <w:rFonts w:ascii="Calibri" w:cs="Calibri" w:eastAsia="Calibri" w:hAnsi="Calibri"/>
-          <w:rtl w:val="0"/>
-        </w:rPr>
-        <w:t xml:space="preserve">Growth Strategy (LLC)</w:t>
-        <w:tab/>
-        <w:t xml:space="preserve">Taipei City, TW</w:t>
-      </w:r>
-      <w:r>
-        <w:rPr>
-          <w:rtl w:val="0"/>
-        </w:rPr>
-      </w:r>
-    </w:p>
-    <w:p>
-      <w:pPr>
         <w:keepNext w:val="0"/>
         <w:keepLines w:val="0"/>
         <w:pageBreakBefore w:val="0"/>
@@ -568,7 +491,84 @@
           <w:rFonts w:ascii="Calibri" w:cs="Calibri" w:eastAsia="Calibri" w:hAnsi="Calibri"/>
           <w:rtl w:val="0"/>
         </w:rPr>
-        <w:t xml:space="preserve">Conducted multi-industry market research and translated business requirements into structured data-driven recommendations for product and packaging strategy optimization</w:t>
+        <w:t xml:space="preserve">Designed cohort analysis to surface segment-specific adoption patterns and engagement drivers</w:t>
+      </w:r>
+    </w:p>
+    <w:p>
+      <w:pPr>
+        <w:tabs>
+          <w:tab w:val="right" w:leader="none" w:pos="10770"/>
+        </w:tabs>
+        <w:spacing w:after="18" w:line="216" w:lineRule="auto"/>
+        <w:ind w:left="720" w:right="-720" w:firstLine="0"/>
+        <w:rPr>
+          <w:rFonts w:ascii="Calibri" w:cs="Calibri" w:eastAsia="Calibri" w:hAnsi="Calibri"/>
+          <w:sz w:val="8"/>
+          <w:szCs w:val="8"/>
+        </w:rPr>
+      </w:pPr>
+      <w:r>
+        <w:rPr>
+          <w:rtl w:val="0"/>
+        </w:rPr>
+      </w:r>
+    </w:p>
+    <w:p>
+      <w:pPr>
+        <w:tabs>
+          <w:tab w:val="right" w:leader="none" w:pos="10770"/>
+        </w:tabs>
+        <w:spacing w:after="18" w:line="216" w:lineRule="auto"/>
+        <w:ind w:left="-540" w:right="-720" w:hanging="180"/>
+        <w:rPr>
+          <w:rFonts w:ascii="Calibri" w:cs="Calibri" w:eastAsia="Calibri" w:hAnsi="Calibri"/>
+        </w:rPr>
+      </w:pPr>
+      <w:r>
+        <w:rPr>
+          <w:rFonts w:ascii="Calibri" w:cs="Calibri" w:eastAsia="Calibri" w:hAnsi="Calibri"/>
+          <w:b w:val="1"/>
+          <w:bCs w:val="1"/>
+          <w:rtl w:val="0"/>
+        </w:rPr>
+        <w:t xml:space="preserve">Marketing Intern</w:t>
+      </w:r>
+      <w:r>
+        <w:rPr>
+          <w:rFonts w:ascii="Calibri" w:cs="Calibri" w:eastAsia="Calibri" w:hAnsi="Calibri"/>
+          <w:rtl w:val="0"/>
+        </w:rPr>
+        <w:tab/>
+        <w:t xml:space="preserve">February 2024 - June 2024</w:t>
+      </w:r>
+    </w:p>
+    <w:p>
+      <w:pPr>
+        <w:tabs>
+          <w:tab w:val="right" w:leader="none" w:pos="10770"/>
+        </w:tabs>
+        <w:spacing w:after="18" w:line="216" w:lineRule="auto"/>
+        <w:ind w:left="-540" w:right="-720" w:hanging="180"/>
+        <w:rPr>
+          <w:b w:val="1"/>
+          <w:bCs w:val="1"/>
+          <w:sz w:val="19"/>
+          <w:szCs w:val="19"/>
+        </w:rPr>
+      </w:pPr>
+      <w:r>
+        <w:rPr>
+          <w:rFonts w:ascii="Calibri" w:cs="Calibri" w:eastAsia="Calibri" w:hAnsi="Calibri"/>
+          <w:rtl w:val="0"/>
+        </w:rPr>
+        <w:t xml:space="preserve">Growth Strategy (LLC)</w:t>
+        <w:tab/>
+        <w:t xml:space="preserve">Taipei City, TW</w:t>
+      </w:r>
+      <w:r>
+        <w:rPr>
+          <w:rtl w:val="0"/>
+        </w:rPr>
       </w:r>
     </w:p>
     <w:p>
@@ -604,84 +604,7 @@
           <w:rFonts w:ascii="Calibri" w:cs="Calibri" w:eastAsia="Calibri" w:hAnsi="Calibri"/>
           <w:rtl w:val="0"/>
         </w:rPr>
-        <w:t xml:space="preserve">Maintained data tracking systems across 10+ client accounts, ensuring accuracy and consistency of campaign performance metrics</w:t>
-      </w:r>
-    </w:p>
-    <w:p>
-      <w:pPr>
-        <w:tabs>
-          <w:tab w:val="right" w:leader="none" w:pos="10770"/>
-        </w:tabs>
-        <w:spacing w:after="18" w:line="216" w:lineRule="auto"/>
-        <w:ind w:left="720" w:right="-720" w:firstLine="0"/>
-        <w:rPr>
-          <w:rFonts w:ascii="Calibri" w:cs="Calibri" w:eastAsia="Calibri" w:hAnsi="Calibri"/>
-          <w:sz w:val="8"/>
-          <w:szCs w:val="8"/>
-        </w:rPr>
-      </w:pPr>
-      <w:r>
-        <w:rPr>
-          <w:rtl w:val="0"/>
-        </w:rPr>
-      </w:r>
-    </w:p>
-    <w:p>
-      <w:pPr>
-        <w:tabs>
-          <w:tab w:val="right" w:leader="none" w:pos="10770"/>
-        </w:tabs>
-        <w:spacing w:after="18" w:line="216" w:lineRule="auto"/>
-        <w:ind w:left="-540" w:right="-720" w:hanging="180"/>
-        <w:rPr>
-          <w:rFonts w:ascii="Calibri" w:cs="Calibri" w:eastAsia="Calibri" w:hAnsi="Calibri"/>
-        </w:rPr>
-      </w:pPr>
-      <w:r>
-        <w:rPr>
-          <w:rFonts w:ascii="Calibri" w:cs="Calibri" w:eastAsia="Calibri" w:hAnsi="Calibri"/>
-          <w:b w:val="1"/>
-          <w:bCs w:val="1"/>
-          <w:rtl w:val="0"/>
-        </w:rPr>
-        <w:t xml:space="preserve">Founder</w:t>
-      </w:r>
-      <w:r>
-        <w:rPr>
-          <w:rFonts w:ascii="Calibri" w:cs="Calibri" w:eastAsia="Calibri" w:hAnsi="Calibri"/>
-          <w:rtl w:val="0"/>
-        </w:rPr>
-        <w:tab/>
-        <w:t xml:space="preserve">September 2023 - April 2024</w:t>
-      </w:r>
-    </w:p>
-    <w:p>
-      <w:pPr>
-        <w:tabs>
-          <w:tab w:val="right" w:leader="none" w:pos="10770"/>
-        </w:tabs>
-        <w:spacing w:after="18" w:line="216" w:lineRule="auto"/>
-        <w:ind w:left="-540" w:right="-720" w:hanging="180"/>
-        <w:rPr>
-          <w:b w:val="1"/>
-          <w:bCs w:val="1"/>
-          <w:sz w:val="19"/>
-          <w:szCs w:val="19"/>
-        </w:rPr>
-      </w:pPr>
-      <w:r>
-        <w:rPr>
-          <w:rFonts w:ascii="Calibri" w:cs="Calibri" w:eastAsia="Calibri" w:hAnsi="Calibri"/>
-          <w:rtl w:val="0"/>
-        </w:rPr>
-        <w:t xml:space="preserve">Pour.selection (Online shop)</w:t>
-        <w:tab/>
-        <w:t xml:space="preserve">New Taipei City, TW</w:t>
-      </w:r>
-      <w:r>
-        <w:rPr>
-          <w:rtl w:val="0"/>
-        </w:rPr>
+        <w:t xml:space="preserve">Conducted multi-industry market research and translated business requirements into structured data-driven recommendations for product and packaging strategy optimization</w:t>
       </w:r>
     </w:p>
     <w:p>
@@ -717,7 +640,84 @@
           <w:rFonts w:ascii="Calibri" w:cs="Calibri" w:eastAsia="Calibri" w:hAnsi="Calibri"/>
           <w:rtl w:val="0"/>
         </w:rPr>
-        <w:t xml:space="preserve">Designed and maintained data workflows to track product performance, customer demand trends, and inventory levels across 540+ SKUs</w:t>
+        <w:t xml:space="preserve">Maintained data tracking systems across 10+ client accounts, ensuring accuracy and consistency of campaign performance metrics</w:t>
+      </w:r>
+    </w:p>
+    <w:p>
+      <w:pPr>
+        <w:tabs>
+          <w:tab w:val="right" w:leader="none" w:pos="10770"/>
+        </w:tabs>
+        <w:spacing w:after="18" w:line="216" w:lineRule="auto"/>
+        <w:ind w:left="720" w:right="-720" w:firstLine="0"/>
+        <w:rPr>
+          <w:rFonts w:ascii="Calibri" w:cs="Calibri" w:eastAsia="Calibri" w:hAnsi="Calibri"/>
+          <w:sz w:val="8"/>
+          <w:szCs w:val="8"/>
+        </w:rPr>
+      </w:pPr>
+      <w:r>
+        <w:rPr>
+          <w:rtl w:val="0"/>
+        </w:rPr>
+      </w:r>
+    </w:p>
+    <w:p>
+      <w:pPr>
+        <w:tabs>
+          <w:tab w:val="right" w:leader="none" w:pos="10770"/>
+        </w:tabs>
+        <w:spacing w:after="18" w:line="216" w:lineRule="auto"/>
+        <w:ind w:left="-540" w:right="-720" w:hanging="180"/>
+        <w:rPr>
+          <w:rFonts w:ascii="Calibri" w:cs="Calibri" w:eastAsia="Calibri" w:hAnsi="Calibri"/>
+        </w:rPr>
+      </w:pPr>
+      <w:r>
+        <w:rPr>
+          <w:rFonts w:ascii="Calibri" w:cs="Calibri" w:eastAsia="Calibri" w:hAnsi="Calibri"/>
+          <w:b w:val="1"/>
+          <w:bCs w:val="1"/>
+          <w:rtl w:val="0"/>
+        </w:rPr>
+        <w:t xml:space="preserve">Founder</w:t>
+      </w:r>
+      <w:r>
+        <w:rPr>
+          <w:rFonts w:ascii="Calibri" w:cs="Calibri" w:eastAsia="Calibri" w:hAnsi="Calibri"/>
+          <w:rtl w:val="0"/>
+        </w:rPr>
+        <w:tab/>
+        <w:t xml:space="preserve">September 2023 - April 2024</w:t>
+      </w:r>
+    </w:p>
+    <w:p>
+      <w:pPr>
+        <w:tabs>
+          <w:tab w:val="right" w:leader="none" w:pos="10770"/>
+        </w:tabs>
+        <w:spacing w:after="18" w:line="216" w:lineRule="auto"/>
+        <w:ind w:left="-540" w:right="-720" w:hanging="180"/>
+        <w:rPr>
+          <w:b w:val="1"/>
+          <w:bCs w:val="1"/>
+          <w:sz w:val="19"/>
+          <w:szCs w:val="19"/>
+        </w:rPr>
+      </w:pPr>
+      <w:r>
+        <w:rPr>
+          <w:rFonts w:ascii="Calibri" w:cs="Calibri" w:eastAsia="Calibri" w:hAnsi="Calibri"/>
+          <w:rtl w:val="0"/>
+        </w:rPr>
+        <w:t xml:space="preserve">Pour.selection (Online shop)</w:t>
+        <w:tab/>
+        <w:t xml:space="preserve">New Taipei City, TW</w:t>
+      </w:r>
+      <w:r>
+        <w:rPr>
+          <w:rtl w:val="0"/>
+        </w:rPr>
       </w:r>
     </w:p>
     <w:p>
@@ -753,272 +753,7 @@
           <w:rFonts w:ascii="Calibri" w:cs="Calibri" w:eastAsia="Calibri" w:hAnsi="Calibri"/>
           <w:rtl w:val="0"/>
         </w:rPr>
-        <w:t xml:space="preserve">Integrated data from multiple sources including Meta analytics and e-commerce platforms to build a unified view of sales performance and marketing effectiveness</w:t>
-      </w:r>
-    </w:p>
-    <w:p>
-      <w:pPr>
-        <w:tabs>
-          <w:tab w:val="right" w:leader="none" w:pos="10770"/>
-        </w:tabs>
-        <w:spacing w:after="18" w:line="216" w:lineRule="auto"/>
-        <w:ind w:left="720" w:right="-720" w:firstLine="0"/>
-        <w:rPr>
-          <w:rFonts w:ascii="Calibri" w:cs="Calibri" w:eastAsia="Calibri" w:hAnsi="Calibri"/>
-          <w:sz w:val="8"/>
-          <w:szCs w:val="8"/>
-        </w:rPr>
-      </w:pPr>
-      <w:r>
-        <w:rPr>
-          <w:rtl w:val="0"/>
-        </w:rPr>
-      </w:r>
-    </w:p>
-    <w:p>
-      <w:pPr>
-        <w:pBdr>
-          <w:top w:color="000000" w:space="0" w:sz="0" w:val="none"/>
-          <w:left w:color="000000" w:space="0" w:sz="0" w:val="none"/>
-          <w:bottom w:color="000000" w:space="0" w:sz="6" w:val="single"/>
-          <w:right w:color="000000" w:space="0" w:sz="0" w:val="none"/>
-        </w:pBdr>
-        <w:spacing w:after="30" w:line="192.00000000000003" w:lineRule="auto"/>
-        <w:ind w:left="-540" w:right="-720" w:hanging="180"/>
-        <w:rPr>
-          <w:rFonts w:ascii="Calibri" w:cs="Calibri" w:eastAsia="Calibri" w:hAnsi="Calibri"/>
-          <w:b w:val="1"/>
-          <w:bCs w:val="1"/>
-          <w:smallCaps w:val="1"/>
-        </w:rPr>
-      </w:pPr>
-      <w:r>
-        <w:rPr>
-          <w:rFonts w:ascii="Calibri" w:cs="Calibri" w:eastAsia="Calibri" w:hAnsi="Calibri"/>
-          <w:b w:val="1"/>
-          <w:bCs w:val="1"/>
-          <w:smallCaps w:val="1"/>
-          <w:rtl w:val="0"/>
-        </w:rPr>
-        <w:t xml:space="preserve">ACADEMIC PROJECTS</w:t>
-      </w:r>
-    </w:p>
-    <w:p>
-      <w:pPr>
-        <w:tabs>
-          <w:tab w:val="right" w:leader="none" w:pos="10770"/>
-        </w:tabs>
-        <w:spacing w:after="30" w:line="192.00000000000003" w:lineRule="auto"/>
-        <w:ind w:left="-540" w:right="-720" w:hanging="180"/>
-        <w:rPr>
-          <w:rFonts w:ascii="Calibri" w:cs="Calibri" w:eastAsia="Calibri" w:hAnsi="Calibri"/>
-        </w:rPr>
-      </w:pPr>
-      <w:r>
-        <w:rPr>
-          <w:rFonts w:ascii="Calibri" w:cs="Calibri" w:eastAsia="Calibri" w:hAnsi="Calibri"/>
-          <w:b w:val="1"/>
-          <w:bCs w:val="1"/>
-          <w:rtl w:val="0"/>
-        </w:rPr>
-        <w:t xml:space="preserve">Florida Housing Price Prediction - Boston University</w:t>
-      </w:r>
-      <w:r>
-        <w:rPr>
-          <w:rFonts w:ascii="Calibri" w:cs="Calibri" w:eastAsia="Calibri" w:hAnsi="Calibri"/>
-          <w:rtl w:val="0"/>
-        </w:rPr>
-        <w:tab/>
-        <w:t xml:space="preserve">November 2025 - December 2025</w:t>
-      </w:r>
-    </w:p>
-    <w:p>
-      <w:pPr>
-        <w:tabs>
-          <w:tab w:val="right" w:leader="none" w:pos="10770"/>
-        </w:tabs>
-        <w:spacing w:after="30" w:line="192.00000000000003" w:lineRule="auto"/>
-        <w:ind w:left="-540" w:right="-720" w:hanging="180"/>
-        <w:rPr>
-          <w:rFonts w:ascii="Calibri" w:cs="Calibri" w:eastAsia="Calibri" w:hAnsi="Calibri"/>
-        </w:rPr>
-      </w:pPr>
-      <w:r>
-        <w:rPr>
-          <w:rFonts w:ascii="Calibri" w:cs="Calibri" w:eastAsia="Calibri" w:hAnsi="Calibri"/>
-          <w:rtl w:val="0"/>
-        </w:rPr>
-        <w:t xml:space="preserve">Course Project BA810 </w:t>
-      </w:r>
-      <w:hyperlink r:id="rId6">
-        <w:r>
-          <w:rPr>
-            <w:rFonts w:ascii="Calibri" w:cs="Calibri" w:eastAsia="Calibri" w:hAnsi="Calibri"/>
-            <w:color w:val="1155cc"/>
-            <w:u w:val="single"/>
-            <w:rtl w:val="0"/>
-          </w:rPr>
-          <w:t xml:space="preserve">https://github.com/ypc0701-cmyk/Florida-Housing-Prediction.git</w:t>
-        </w:r>
-      </w:hyperlink>
-      <w:r>
-        <w:rPr>
-          <w:rFonts w:ascii="Calibri" w:cs="Calibri" w:eastAsia="Calibri" w:hAnsi="Calibri"/>
-          <w:rtl w:val="0"/>
-        </w:rPr>
-        <w:t xml:space="preserve"> </w:t>
-        <w:tab/>
-        <w:t xml:space="preserve">Boston, MA</w:t>
-      </w:r>
-    </w:p>
-    <w:p>
-      <w:pPr>
-        <w:tabs>
-          <w:tab w:val="right" w:leader="none" w:pos="10770"/>
-        </w:tabs>
-        <w:spacing w:after="30" w:line="192.00000000000003" w:lineRule="auto"/>
-        <w:ind w:left="-540" w:right="-720" w:hanging="180"/>
-        <w:rPr>
-          <w:rFonts w:ascii="Calibri" w:cs="Calibri" w:eastAsia="Calibri" w:hAnsi="Calibri"/>
-          <w:sz w:val="8"/>
-          <w:szCs w:val="8"/>
-        </w:rPr>
-      </w:pPr>
-      <w:r>
-        <w:rPr>
-          <w:rtl w:val="0"/>
-        </w:rPr>
-      </w:r>
-    </w:p>
-    <w:p>
-      <w:pPr>
-        <w:numPr>
-          <w:ilvl w:val="0"/>
-          <w:numId w:val="1"/>
-        </w:numPr>
-        <w:tabs>
-          <w:tab w:val="right" w:leader="none" w:pos="10770"/>
-        </w:tabs>
-        <w:spacing w:after="30" w:line="192.00000000000003" w:lineRule="auto"/>
-        <w:ind w:left="-180" w:right="-720" w:hanging="270"/>
-        <w:rPr>
-          <w:rFonts w:ascii="Calibri" w:cs="Calibri" w:eastAsia="Calibri" w:hAnsi="Calibri"/>
-        </w:rPr>
-      </w:pPr>
-      <w:r>
-        <w:rPr>
-          <w:rFonts w:ascii="Calibri" w:cs="Calibri" w:eastAsia="Calibri" w:hAnsi="Calibri"/>
-          <w:rtl w:val="0"/>
-        </w:rPr>
-        <w:t xml:space="preserve">Designed and executed an end-to-end data pipeline in Python including data ingestion, cleaning, preprocessing, and feature engineering to prepare large-scale structured datasets for modeling</w:t>
-      </w:r>
-    </w:p>
-    <w:p>
-      <w:pPr>
-        <w:numPr>
-          <w:ilvl w:val="0"/>
-          <w:numId w:val="1"/>
-        </w:numPr>
-        <w:tabs>
-          <w:tab w:val="right" w:leader="none" w:pos="10770"/>
-        </w:tabs>
-        <w:spacing w:after="30" w:line="192.00000000000003" w:lineRule="auto"/>
-        <w:ind w:left="-180" w:right="-720" w:hanging="270"/>
-        <w:rPr>
-          <w:rFonts w:ascii="Calibri" w:cs="Calibri" w:eastAsia="Calibri" w:hAnsi="Calibri"/>
-        </w:rPr>
-      </w:pPr>
-      <w:r>
-        <w:rPr>
-          <w:rFonts w:ascii="Calibri" w:cs="Calibri" w:eastAsia="Calibri" w:hAnsi="Calibri"/>
-          <w:rtl w:val="0"/>
-        </w:rPr>
-        <w:t xml:space="preserve">Built, tuned, and evaluated four machine learning models including linear regression, decision tree, random forest, and gradient boosting to predict housing prices</w:t>
-      </w:r>
-    </w:p>
-    <w:p>
-      <w:pPr>
-        <w:tabs>
-          <w:tab w:val="right" w:leader="none" w:pos="10770"/>
-        </w:tabs>
-        <w:spacing w:after="30" w:line="192.00000000000003" w:lineRule="auto"/>
-        <w:ind w:left="-180" w:right="-720" w:hanging="540"/>
-        <w:rPr>
-          <w:rFonts w:ascii="Calibri" w:cs="Calibri" w:eastAsia="Calibri" w:hAnsi="Calibri"/>
-        </w:rPr>
-      </w:pPr>
-      <w:r>
-        <w:rPr>
-          <w:rFonts w:ascii="Calibri" w:cs="Calibri" w:eastAsia="Calibri" w:hAnsi="Calibri"/>
-          <w:b w:val="1"/>
-          <w:bCs w:val="1"/>
-          <w:rtl w:val="0"/>
-        </w:rPr>
-        <w:t xml:space="preserve">Amazon Holiday Shopping Analysis - Boston University</w:t>
-      </w:r>
-      <w:r>
-        <w:rPr>
-          <w:rFonts w:ascii="Calibri" w:cs="Calibri" w:eastAsia="Calibri" w:hAnsi="Calibri"/>
-          <w:rtl w:val="0"/>
-        </w:rPr>
-        <w:tab/>
-        <w:t xml:space="preserve">September 2025 - October 2025</w:t>
-      </w:r>
-    </w:p>
-    <w:p>
-      <w:pPr>
-        <w:tabs>
-          <w:tab w:val="right" w:leader="none" w:pos="10770"/>
-        </w:tabs>
-        <w:spacing w:after="30" w:line="192.00000000000003" w:lineRule="auto"/>
-        <w:ind w:left="-180" w:right="-720" w:hanging="540"/>
-        <w:rPr>
-          <w:rFonts w:ascii="Calibri" w:cs="Calibri" w:eastAsia="Calibri" w:hAnsi="Calibri"/>
-        </w:rPr>
-      </w:pPr>
-      <w:r>
-        <w:rPr>
-          <w:rFonts w:ascii="Calibri" w:cs="Calibri" w:eastAsia="Calibri" w:hAnsi="Calibri"/>
-          <w:rtl w:val="0"/>
-        </w:rPr>
-        <w:t xml:space="preserve">Course Project BA780 </w:t>
-      </w:r>
-      <w:hyperlink r:id="rId7">
-        <w:r>
-          <w:rPr>
-            <w:rFonts w:ascii="Calibri" w:cs="Calibri" w:eastAsia="Calibri" w:hAnsi="Calibri"/>
-            <w:color w:val="1155cc"/>
-            <w:u w:val="single"/>
-            <w:rtl w:val="0"/>
-          </w:rPr>
-          <w:t xml:space="preserve">https://github.com/ypc0701-cmyk/B03-Project-Amazon-Holiday-Shopping-Analysis</w:t>
-        </w:r>
-      </w:hyperlink>
-      <w:r>
-        <w:rPr>
-          <w:rFonts w:ascii="Calibri" w:cs="Calibri" w:eastAsia="Calibri" w:hAnsi="Calibri"/>
-          <w:rtl w:val="0"/>
-        </w:rPr>
-        <w:t xml:space="preserve">       Boston, MA</w:t>
-      </w:r>
-    </w:p>
-    <w:p>
-      <w:pPr>
-        <w:tabs>
-          <w:tab w:val="right" w:leader="none" w:pos="10770"/>
-        </w:tabs>
-        <w:spacing w:after="30" w:line="192.00000000000003" w:lineRule="auto"/>
-        <w:ind w:left="-180" w:right="-720" w:hanging="540"/>
-        <w:rPr>
-          <w:rFonts w:ascii="Calibri" w:cs="Calibri" w:eastAsia="Calibri" w:hAnsi="Calibri"/>
-          <w:sz w:val="6"/>
-          <w:szCs w:val="6"/>
-        </w:rPr>
-      </w:pPr>
-      <w:r>
-        <w:rPr>
-          <w:rtl w:val="0"/>
-        </w:rPr>
+        <w:t xml:space="preserve">Designed and maintained data workflows to track product performance, customer demand trends, and inventory levels across 540+ SKUs</w:t>
       </w:r>
     </w:p>
     <w:p>
@@ -1042,7 +777,7 @@
         <w:tabs>
           <w:tab w:val="right" w:leader="none" w:pos="10770"/>
         </w:tabs>
-        <w:spacing w:after="30" w:before="0" w:line="192.00000000000003" w:lineRule="auto"/>
+        <w:spacing w:after="18" w:before="0" w:line="216" w:lineRule="auto"/>
         <w:ind w:left="-180" w:right="-720" w:hanging="270"/>
         <w:jc w:val="left"/>
         <w:rPr>
@@ -1054,7 +789,272 @@
           <w:rFonts w:ascii="Calibri" w:cs="Calibri" w:eastAsia="Calibri" w:hAnsi="Calibri"/>
           <w:rtl w:val="0"/>
         </w:rPr>
-        <w:t xml:space="preserve">Processed and analyzed 1.8M Amazon transactions using Python to uncover holiday demand patterns and category growth opportunities</w:t>
+        <w:t xml:space="preserve">Integrated data from multiple sources including Meta analytics and e-commerce platforms to build a unified view of sales performance and marketing effectiveness</w:t>
+      </w:r>
+    </w:p>
+    <w:p>
+      <w:pPr>
+        <w:tabs>
+          <w:tab w:val="right" w:leader="none" w:pos="10770"/>
+        </w:tabs>
+        <w:spacing w:after="18" w:line="216" w:lineRule="auto"/>
+        <w:ind w:left="720" w:right="-720" w:firstLine="0"/>
+        <w:rPr>
+          <w:rFonts w:ascii="Calibri" w:cs="Calibri" w:eastAsia="Calibri" w:hAnsi="Calibri"/>
+          <w:sz w:val="8"/>
+          <w:szCs w:val="8"/>
+        </w:rPr>
+      </w:pPr>
+      <w:r>
+        <w:rPr>
+          <w:rtl w:val="0"/>
+        </w:rPr>
+      </w:r>
+    </w:p>
+    <w:p>
+      <w:pPr>
+        <w:pBdr>
+          <w:top w:color="000000" w:space="0" w:sz="0" w:val="none"/>
+          <w:left w:color="000000" w:space="0" w:sz="0" w:val="none"/>
+          <w:bottom w:color="000000" w:space="0" w:sz="6" w:val="single"/>
+          <w:right w:color="000000" w:space="0" w:sz="0" w:val="none"/>
+        </w:pBdr>
+        <w:spacing w:after="30" w:line="192.00000000000003" w:lineRule="auto"/>
+        <w:ind w:left="-540" w:right="-720" w:hanging="180"/>
+        <w:rPr>
+          <w:rFonts w:ascii="Calibri" w:cs="Calibri" w:eastAsia="Calibri" w:hAnsi="Calibri"/>
+          <w:b w:val="1"/>
+          <w:bCs w:val="1"/>
+          <w:smallCaps w:val="1"/>
+        </w:rPr>
+      </w:pPr>
+      <w:r>
+        <w:rPr>
+          <w:rFonts w:ascii="Calibri" w:cs="Calibri" w:eastAsia="Calibri" w:hAnsi="Calibri"/>
+          <w:b w:val="1"/>
+          <w:bCs w:val="1"/>
+          <w:smallCaps w:val="1"/>
+          <w:rtl w:val="0"/>
+        </w:rPr>
+        <w:t xml:space="preserve">ACADEMIC PROJECTS</w:t>
+      </w:r>
+    </w:p>
+    <w:p>
+      <w:pPr>
+        <w:tabs>
+          <w:tab w:val="right" w:leader="none" w:pos="10770"/>
+        </w:tabs>
+        <w:spacing w:after="30" w:line="192.00000000000003" w:lineRule="auto"/>
+        <w:ind w:left="-540" w:right="-720" w:hanging="180"/>
+        <w:rPr>
+          <w:rFonts w:ascii="Calibri" w:cs="Calibri" w:eastAsia="Calibri" w:hAnsi="Calibri"/>
+        </w:rPr>
+      </w:pPr>
+      <w:r>
+        <w:rPr>
+          <w:rFonts w:ascii="Calibri" w:cs="Calibri" w:eastAsia="Calibri" w:hAnsi="Calibri"/>
+          <w:b w:val="1"/>
+          <w:bCs w:val="1"/>
+          <w:rtl w:val="0"/>
+        </w:rPr>
+        <w:t xml:space="preserve">Florida Housing Price Prediction - Boston University</w:t>
+      </w:r>
+      <w:r>
+        <w:rPr>
+          <w:rFonts w:ascii="Calibri" w:cs="Calibri" w:eastAsia="Calibri" w:hAnsi="Calibri"/>
+          <w:rtl w:val="0"/>
+        </w:rPr>
+        <w:tab/>
+        <w:t xml:space="preserve">November 2025 - December 2025</w:t>
+      </w:r>
+    </w:p>
+    <w:p>
+      <w:pPr>
+        <w:tabs>
+          <w:tab w:val="right" w:leader="none" w:pos="10770"/>
+        </w:tabs>
+        <w:spacing w:after="30" w:line="192.00000000000003" w:lineRule="auto"/>
+        <w:ind w:left="-540" w:right="-720" w:hanging="180"/>
+        <w:rPr>
+          <w:rFonts w:ascii="Calibri" w:cs="Calibri" w:eastAsia="Calibri" w:hAnsi="Calibri"/>
+        </w:rPr>
+      </w:pPr>
+      <w:r>
+        <w:rPr>
+          <w:rFonts w:ascii="Calibri" w:cs="Calibri" w:eastAsia="Calibri" w:hAnsi="Calibri"/>
+          <w:rtl w:val="0"/>
+        </w:rPr>
+        <w:t xml:space="preserve">Course Project BA810 </w:t>
+      </w:r>
+      <w:hyperlink r:id="rId7">
+        <w:r>
+          <w:rPr>
+            <w:rFonts w:ascii="Calibri" w:cs="Calibri" w:eastAsia="Calibri" w:hAnsi="Calibri"/>
+            <w:color w:val="1155cc"/>
+            <w:u w:val="single"/>
+            <w:rtl w:val="0"/>
+          </w:rPr>
+          <w:t xml:space="preserve">https://github.com/ypc0701-cmyk/Florida-Housing-Prediction.git</w:t>
+        </w:r>
+      </w:hyperlink>
+      <w:r>
+        <w:rPr>
+          <w:rFonts w:ascii="Calibri" w:cs="Calibri" w:eastAsia="Calibri" w:hAnsi="Calibri"/>
+          <w:rtl w:val="0"/>
+        </w:rPr>
+        <w:t xml:space="preserve"> </w:t>
+        <w:tab/>
+        <w:t xml:space="preserve">Boston, MA</w:t>
+      </w:r>
+    </w:p>
+    <w:p>
+      <w:pPr>
+        <w:tabs>
+          <w:tab w:val="right" w:leader="none" w:pos="10770"/>
+        </w:tabs>
+        <w:spacing w:after="30" w:line="192.00000000000003" w:lineRule="auto"/>
+        <w:ind w:left="-540" w:right="-720" w:hanging="180"/>
+        <w:rPr>
+          <w:rFonts w:ascii="Calibri" w:cs="Calibri" w:eastAsia="Calibri" w:hAnsi="Calibri"/>
+          <w:sz w:val="8"/>
+          <w:szCs w:val="8"/>
+        </w:rPr>
+      </w:pPr>
+      <w:r>
+        <w:rPr>
+          <w:rtl w:val="0"/>
+        </w:rPr>
+      </w:r>
+    </w:p>
+    <w:p>
+      <w:pPr>
+        <w:numPr>
+          <w:ilvl w:val="0"/>
+          <w:numId w:val="1"/>
+        </w:numPr>
+        <w:tabs>
+          <w:tab w:val="right" w:leader="none" w:pos="10770"/>
+        </w:tabs>
+        <w:spacing w:after="30" w:line="192.00000000000003" w:lineRule="auto"/>
+        <w:ind w:left="-180" w:right="-720" w:hanging="270"/>
+        <w:rPr>
+          <w:rFonts w:ascii="Calibri" w:cs="Calibri" w:eastAsia="Calibri" w:hAnsi="Calibri"/>
+        </w:rPr>
+      </w:pPr>
+      <w:r>
+        <w:rPr>
+          <w:rFonts w:ascii="Calibri" w:cs="Calibri" w:eastAsia="Calibri" w:hAnsi="Calibri"/>
+          <w:rtl w:val="0"/>
+        </w:rPr>
+        <w:t xml:space="preserve">Designed and executed an end-to-end data pipeline in Python including data ingestion, cleaning, preprocessing, and feature engineering to prepare large-scale structured datasets for modeling</w:t>
+      </w:r>
+    </w:p>
+    <w:p>
+      <w:pPr>
+        <w:numPr>
+          <w:ilvl w:val="0"/>
+          <w:numId w:val="1"/>
+        </w:numPr>
+        <w:tabs>
+          <w:tab w:val="right" w:leader="none" w:pos="10770"/>
+        </w:tabs>
+        <w:spacing w:after="30" w:line="192.00000000000003" w:lineRule="auto"/>
+        <w:ind w:left="-180" w:right="-720" w:hanging="270"/>
+        <w:rPr>
+          <w:rFonts w:ascii="Calibri" w:cs="Calibri" w:eastAsia="Calibri" w:hAnsi="Calibri"/>
+        </w:rPr>
+      </w:pPr>
+      <w:r>
+        <w:rPr>
+          <w:rFonts w:ascii="Calibri" w:cs="Calibri" w:eastAsia="Calibri" w:hAnsi="Calibri"/>
+          <w:rtl w:val="0"/>
+        </w:rPr>
+        <w:t xml:space="preserve">Built, tuned, and evaluated four machine learning models including linear regression, decision tree, random forest, and gradient boosting to predict housing prices</w:t>
+      </w:r>
+    </w:p>
+    <w:p>
+      <w:pPr>
+        <w:tabs>
+          <w:tab w:val="right" w:leader="none" w:pos="10770"/>
+        </w:tabs>
+        <w:spacing w:after="30" w:line="192.00000000000003" w:lineRule="auto"/>
+        <w:ind w:left="-180" w:right="-720" w:hanging="540"/>
+        <w:rPr>
+          <w:rFonts w:ascii="Calibri" w:cs="Calibri" w:eastAsia="Calibri" w:hAnsi="Calibri"/>
+        </w:rPr>
+      </w:pPr>
+      <w:r>
+        <w:rPr>
+          <w:rFonts w:ascii="Calibri" w:cs="Calibri" w:eastAsia="Calibri" w:hAnsi="Calibri"/>
+          <w:b w:val="1"/>
+          <w:bCs w:val="1"/>
+          <w:rtl w:val="0"/>
+        </w:rPr>
+        <w:t xml:space="preserve">Amazon Holiday Shopping Analysis - Boston University</w:t>
+      </w:r>
+      <w:r>
+        <w:rPr>
+          <w:rFonts w:ascii="Calibri" w:cs="Calibri" w:eastAsia="Calibri" w:hAnsi="Calibri"/>
+          <w:rtl w:val="0"/>
+        </w:rPr>
+        <w:tab/>
+        <w:t xml:space="preserve">September 2025 - October 2025</w:t>
+      </w:r>
+    </w:p>
+    <w:p>
+      <w:pPr>
+        <w:tabs>
+          <w:tab w:val="right" w:leader="none" w:pos="10770"/>
+        </w:tabs>
+        <w:spacing w:after="30" w:line="192.00000000000003" w:lineRule="auto"/>
+        <w:ind w:left="-180" w:right="-720" w:hanging="540"/>
+        <w:rPr>
+          <w:rFonts w:ascii="Calibri" w:cs="Calibri" w:eastAsia="Calibri" w:hAnsi="Calibri"/>
+        </w:rPr>
+      </w:pPr>
+      <w:r>
+        <w:rPr>
+          <w:rFonts w:ascii="Calibri" w:cs="Calibri" w:eastAsia="Calibri" w:hAnsi="Calibri"/>
+          <w:rtl w:val="0"/>
+        </w:rPr>
+        <w:t xml:space="preserve">Course Project BA780 </w:t>
+      </w:r>
+      <w:hyperlink r:id="rId8">
+        <w:r>
+          <w:rPr>
+            <w:rFonts w:ascii="Calibri" w:cs="Calibri" w:eastAsia="Calibri" w:hAnsi="Calibri"/>
+            <w:color w:val="1155cc"/>
+            <w:u w:val="single"/>
+            <w:rtl w:val="0"/>
+          </w:rPr>
+          <w:t xml:space="preserve">https://github.com/ypc0701-cmyk/B03-Project-Amazon-Holiday-Shopping-Analysis</w:t>
+        </w:r>
+      </w:hyperlink>
+      <w:r>
+        <w:rPr>
+          <w:rFonts w:ascii="Calibri" w:cs="Calibri" w:eastAsia="Calibri" w:hAnsi="Calibri"/>
+          <w:rtl w:val="0"/>
+        </w:rPr>
+        <w:t xml:space="preserve">       Boston, MA</w:t>
+      </w:r>
+    </w:p>
+    <w:p>
+      <w:pPr>
+        <w:tabs>
+          <w:tab w:val="right" w:leader="none" w:pos="10770"/>
+        </w:tabs>
+        <w:spacing w:after="30" w:line="192.00000000000003" w:lineRule="auto"/>
+        <w:ind w:left="-180" w:right="-720" w:hanging="540"/>
+        <w:rPr>
+          <w:rFonts w:ascii="Calibri" w:cs="Calibri" w:eastAsia="Calibri" w:hAnsi="Calibri"/>
+          <w:sz w:val="6"/>
+          <w:szCs w:val="6"/>
+        </w:rPr>
+      </w:pPr>
+      <w:r>
+        <w:rPr>
+          <w:rtl w:val="0"/>
+        </w:rPr>
       </w:r>
     </w:p>
     <w:p>
@@ -1090,7 +1090,75 @@
           <w:rFonts w:ascii="Calibri" w:cs="Calibri" w:eastAsia="Calibri" w:hAnsi="Calibri"/>
           <w:rtl w:val="0"/>
         </w:rPr>
+        <w:t xml:space="preserve">Processed and analyzed 1.8M Amazon transactions using Python to uncover holiday demand patterns and category growth opportunities</w:t>
+      </w:r>
+    </w:p>
+    <w:p>
+      <w:pPr>
+        <w:keepNext w:val="0"/>
+        <w:keepLines w:val="0"/>
+        <w:pageBreakBefore w:val="0"/>
+        <w:widowControl w:val="1"/>
+        <w:numPr>
+          <w:ilvl w:val="0"/>
+          <w:numId w:val="1"/>
+        </w:numPr>
+        <w:pBdr>
+          <w:top w:space="0" w:sz="0" w:val="nil"/>
+          <w:left w:space="0" w:sz="0" w:val="nil"/>
+          <w:bottom w:space="0" w:sz="0" w:val="nil"/>
+          <w:right w:space="0" w:sz="0" w:val="nil"/>
+          <w:between w:space="0" w:sz="0" w:val="nil"/>
+        </w:pBdr>
+        <w:shd w:fill="auto" w:val="clear"/>
+        <w:tabs>
+          <w:tab w:val="right" w:leader="none" w:pos="10770"/>
+        </w:tabs>
+        <w:spacing w:after="30" w:before="0" w:line="192.00000000000003" w:lineRule="auto"/>
+        <w:ind w:left="-180" w:right="-720" w:hanging="270"/>
+        <w:jc w:val="left"/>
+        <w:rPr>
+          <w:rFonts w:ascii="Calibri" w:cs="Calibri" w:eastAsia="Calibri" w:hAnsi="Calibri"/>
+        </w:rPr>
+      </w:pPr>
+      <w:r>
+        <w:rPr>
+          <w:rFonts w:ascii="Calibri" w:cs="Calibri" w:eastAsia="Calibri" w:hAnsi="Calibri"/>
+          <w:rtl w:val="0"/>
+        </w:rPr>
         <w:t xml:space="preserve">Designed data transformation and visualization workflows to extract insights from large-scale structured datasets across multiple categories and demographic segments</w:t>
+      </w:r>
+    </w:p>
+    <w:p>
+      <w:pPr>
+        <w:keepNext w:val="0"/>
+        <w:keepLines w:val="0"/>
+        <w:pageBreakBefore w:val="0"/>
+        <w:widowControl w:val="1"/>
+        <w:pBdr>
+          <w:top w:space="0" w:sz="0" w:val="nil"/>
+          <w:left w:space="0" w:sz="0" w:val="nil"/>
+          <w:bottom w:space="0" w:sz="0" w:val="nil"/>
+          <w:right w:space="0" w:sz="0" w:val="nil"/>
+          <w:between w:space="0" w:sz="0" w:val="nil"/>
+        </w:pBdr>
+        <w:shd w:fill="auto" w:val="clear"/>
+        <w:tabs>
+          <w:tab w:val="right" w:leader="none" w:pos="10770"/>
+        </w:tabs>
+        <w:spacing w:after="30" w:before="0" w:line="192.00000000000003" w:lineRule="auto"/>
+        <w:ind w:left="720" w:right="-720" w:firstLine="0"/>
+        <w:jc w:val="left"/>
+        <w:rPr>
+          <w:rFonts w:ascii="Calibri" w:cs="Calibri" w:eastAsia="Calibri" w:hAnsi="Calibri"/>
+          <w:sz w:val="12"/>
+          <w:szCs w:val="12"/>
+        </w:rPr>
+      </w:pPr>
+      <w:r>
+        <w:rPr>
+          <w:rtl w:val="0"/>
+        </w:rPr>
       </w:r>
     </w:p>
     <w:p>
@@ -1175,8 +1243,8 @@
       </w:r>
     </w:p>
     <w:sectPr>
-      <w:headerReference r:id="rId8" w:type="default"/>
-      <w:footerReference r:id="rId9" w:type="default"/>
+      <w:headerReference r:id="rId9" w:type="default"/>
+      <w:footerReference r:id="rId10" w:type="default"/>
       <w:pgSz w:h="15840" w:w="12240" w:orient="portrait"/>
       <w:pgMar w:bottom="1440" w:top="1440" w:left="1440" w:right="1440" w:header="720" w:footer="720"/>
       <w:pgNumType w:start="1"/>
@@ -1869,4 +1937,19 @@
   </a:objectDefaults>
   <a:extraClrSchemeLst/>
 </a:theme>
+</file>
+
+<file path=customXML/item1.xml><?xml version="1.0" encoding="utf-8"?>
+<go:gDocsCustomXmlDataStorage xmlns:go="http://customooxmlschemas.google.com/" xmlns:r="http://schemas.openxmlformats.org/officeDocument/2006/relationships" uri="GoogleDocsCustomDataVersion2">
+  <go:docsCustomData xmlns:go="http://customooxmlschemas.google.com/" roundtripDataSignature="AMtx7mjPMC/LcttfFxYMSLAdOIgpUJA4LA==">CgMxLjA4AHIhMTN5UFJUQTBTYnZuUV9YLTEwMTZZSzNtVTFhM0NJbHlD</go:docsCustomData>
+</go:gDocsCustomXmlDataStorage>
+</file>
+
+<file path=customXML/itemProps1.xml><?xml version="1.0" encoding="utf-8"?>
+<ds:datastoreItem xmlns:ds="http://schemas.openxmlformats.org/officeDocument/2006/customXml" ds:itemID="{11111111-1234-1234-1234-123412341234}">
+  <ds:schemaRefs>
+    <ds:schemaRef ds:uri="http://schemas.openxmlformats.org/officeDocument/2006/relationships"/>
+    <ds:schemaRef ds:uri="http://customooxmlschemas.google.com/"/>
+  </ds:schemaRefs>
+</ds:datastoreItem>
 </file>
</xml_diff>